<commit_message>
Thêm phần chương 2 php
</commit_message>
<xml_diff>
--- a/thesis/baocao.docx
+++ b/thesis/baocao.docx
@@ -3628,9 +3628,6 @@
     <w:p>
       <w:pPr>
         <w:pStyle w:val="Heading3"/>
-        <w:rPr>
-          <w:lang w:val="vi-VN"/>
-        </w:rPr>
       </w:pPr>
       <w:r>
         <w:rPr>
@@ -3644,6 +3641,29 @@
         </w:rPr>
         <w:t>ngôn ngữ PHP</w:t>
       </w:r>
+      <w:r>
+        <w:rPr>
+          <w:lang w:val="vi-VN"/>
+        </w:rPr>
+        <w:t xml:space="preserve"> </w:t>
+      </w:r>
+    </w:p>
+    <w:p>
+      <w:pPr>
+        <w:pStyle w:val="nd"/>
+        <w:rPr>
+          <w:lang w:val="vi-VN"/>
+        </w:rPr>
+      </w:pPr>
+      <w:r>
+        <w:t xml:space="preserve">PHP là từ viết tắt của thuật ngữ Personal Home Page và hiện nay đang có tên Hypertext Preprocessor. Đây là một dạng mã lệnh hoặc một chuỗi ngôn ngữ kịch bản. Trong đó, ngôn ngữ PHP chủ yếu được phát triển để dành cho những ứng dụng nằm trên máy </w:t>
+      </w:r>
+      <w:r>
+        <w:t>chủ</w:t>
+      </w:r>
+      <w:r>
+        <w:t>.</w:t>
+      </w:r>
     </w:p>
     <w:p>
       <w:pPr>
@@ -3652,7 +3672,6 @@
           <w:lang w:val="vi-VN"/>
         </w:rPr>
       </w:pPr>
-      <w:bookmarkStart w:id="2" w:name="_Toc218514168"/>
       <w:r>
         <w:t>Lịch</w:t>
       </w:r>
@@ -3662,77 +3681,239 @@
         </w:rPr>
         <w:t xml:space="preserve"> sử phát triển</w:t>
       </w:r>
+    </w:p>
+    <w:p>
+      <w:pPr>
+        <w:pStyle w:val="nd"/>
+        <w:rPr>
+          <w:lang w:val="vi-VN"/>
+        </w:rPr>
+      </w:pPr>
+      <w:r>
+        <w:rPr>
+          <w:lang w:val="vi-VN"/>
+        </w:rPr>
+        <w:t xml:space="preserve">Năm </w:t>
+      </w:r>
+      <w:r>
+        <w:rPr>
+          <w:lang w:val="vi-VN"/>
+        </w:rPr>
+        <w:t>1994: PHP được tạo ra bởi Rasmus Lerdorf, ban đầu chỉ là một tập hợp các kịch bản viết bằng ngôn ngữ C để quản lý và theo dõi lượt truy cập trang cá nhân của ông. Công cụ này được đặt tên là Personal Home Page Tools (PHP Tools).</w:t>
+      </w:r>
+    </w:p>
+    <w:p>
+      <w:pPr>
+        <w:pStyle w:val="nd"/>
+        <w:rPr>
+          <w:lang w:val="vi-VN"/>
+        </w:rPr>
+      </w:pPr>
+      <w:r>
+        <w:rPr>
+          <w:lang w:val="vi-VN"/>
+        </w:rPr>
+        <w:t>Năm 1995</w:t>
+      </w:r>
+      <w:r>
+        <w:rPr>
+          <w:lang w:val="vi-VN"/>
+        </w:rPr>
+        <w:t>: Sau khi công bố mã nguồn của PHP Tools, Rasmus đã phát triển thêm chức năng hỗ trợ xử lý biểu mẫu web và tương tác với cơ sở dữ liệu. Công cụ này được đặt tên là PHP/FI (Personal Home Page/Form Interpreter), cho phép lập trình viên tạo các trang web động. Đây là phiên bản PHP đầu tiên có thể sử dụng rộng rãi.</w:t>
+      </w:r>
+    </w:p>
+    <w:p>
+      <w:pPr>
+        <w:pStyle w:val="nd"/>
+        <w:rPr>
+          <w:lang w:val="vi-VN"/>
+        </w:rPr>
+      </w:pPr>
+      <w:r>
+        <w:rPr>
+          <w:lang w:val="vi-VN"/>
+        </w:rPr>
+        <w:lastRenderedPageBreak/>
+        <w:t xml:space="preserve">Năm </w:t>
+      </w:r>
+      <w:r>
+        <w:rPr>
+          <w:lang w:val="vi-VN"/>
+        </w:rPr>
+        <w:t>1997: Sự phổ biến của PHP/FI dẫn đến việc cần một hệ thống mạnh mẽ hơn. Zeev Suraski và Andi Gutmans, hai lập trình viên từ Israel, đã tiến hành viết lại cốt lõi của PHP. Kết quả là một phiên bản ổn định và hiệu quả hơn, đặt nền móng cho PHP 3.</w:t>
+      </w:r>
+    </w:p>
+    <w:p>
+      <w:pPr>
+        <w:pStyle w:val="nd"/>
+        <w:rPr>
+          <w:lang w:val="vi-VN"/>
+        </w:rPr>
+      </w:pPr>
+      <w:r>
+        <w:rPr>
+          <w:lang w:val="vi-VN"/>
+        </w:rPr>
+        <w:t>Năm</w:t>
+      </w:r>
+      <w:r>
+        <w:rPr>
+          <w:lang w:val="vi-VN"/>
+        </w:rPr>
+        <w:t xml:space="preserve"> </w:t>
+      </w:r>
+      <w:r>
+        <w:rPr>
+          <w:lang w:val="vi-VN"/>
+        </w:rPr>
+        <w:t>1998: PHP 3 chính thức ra mắt, đánh dấu bước ngoặt lớn trong lịch sử phát triển của ngôn ngữ.</w:t>
+      </w:r>
+    </w:p>
+    <w:p>
+      <w:pPr>
+        <w:pStyle w:val="nd"/>
+        <w:rPr>
+          <w:lang w:val="vi-VN"/>
+        </w:rPr>
+      </w:pPr>
+      <w:r>
+        <w:rPr>
+          <w:lang w:val="vi-VN"/>
+        </w:rPr>
+        <w:t>Năm</w:t>
+      </w:r>
+      <w:r>
+        <w:rPr>
+          <w:lang w:val="vi-VN"/>
+        </w:rPr>
+        <w:t xml:space="preserve"> </w:t>
+      </w:r>
+      <w:r>
+        <w:rPr>
+          <w:lang w:val="vi-VN"/>
+        </w:rPr>
+        <w:t>2000: PHP 4 ra đời, sử dụng Zend Engine 1.0, một công cụ thực thi mới được phát triển bởi Zeev Suraski và Andi Gutmans. Phiên bản này cải thiện đáng kể hiệu suất và khả năng mở rộng, làm cho PHP trở thành lựa chọn ưu tiên cho các dự án lớn.</w:t>
+      </w:r>
+    </w:p>
+    <w:p>
+      <w:pPr>
+        <w:pStyle w:val="nd"/>
+        <w:rPr>
+          <w:lang w:val="vi-VN"/>
+        </w:rPr>
+      </w:pPr>
+      <w:r>
+        <w:rPr>
+          <w:lang w:val="vi-VN"/>
+        </w:rPr>
+        <w:t>Năm</w:t>
+      </w:r>
+      <w:r>
+        <w:rPr>
+          <w:lang w:val="vi-VN"/>
+        </w:rPr>
+        <w:t xml:space="preserve"> </w:t>
+      </w:r>
+      <w:r>
+        <w:rPr>
+          <w:lang w:val="vi-VN"/>
+        </w:rPr>
+        <w:t>2004: PHP 5 ra mắt với nhiều cải tiến mạnh mẽ nhờ Zend Engine 2.0. Phiên bản này đánh dấu sự trưởng thành của PHP trong việc hỗ trợ các mô hình lập trình hiện đại.</w:t>
+      </w:r>
+    </w:p>
+    <w:p>
+      <w:pPr>
+        <w:pStyle w:val="nd"/>
+        <w:rPr>
+          <w:lang w:val="vi-VN"/>
+        </w:rPr>
+      </w:pPr>
+      <w:r>
+        <w:rPr>
+          <w:lang w:val="vi-VN"/>
+        </w:rPr>
+        <w:t>Năm</w:t>
+      </w:r>
+      <w:r>
+        <w:rPr>
+          <w:lang w:val="vi-VN"/>
+        </w:rPr>
+        <w:t xml:space="preserve"> </w:t>
+      </w:r>
+      <w:r>
+        <w:rPr>
+          <w:lang w:val="vi-VN"/>
+        </w:rPr>
+        <w:t>2015: PHP 7 chính thức phát hành, sử dụng Zend Engine 3.0, mang lại những cải tiến vượt trội về hiệu suất và hiệu quả.</w:t>
+      </w:r>
+    </w:p>
+    <w:p>
+      <w:pPr>
+        <w:pStyle w:val="nd"/>
+        <w:rPr>
+          <w:lang w:val="vi-VN"/>
+        </w:rPr>
+      </w:pPr>
+      <w:r>
+        <w:rPr>
+          <w:lang w:val="vi-VN"/>
+        </w:rPr>
+        <w:t>Năm</w:t>
+      </w:r>
+      <w:r>
+        <w:rPr>
+          <w:lang w:val="vi-VN"/>
+        </w:rPr>
+        <w:t xml:space="preserve"> </w:t>
+      </w:r>
+      <w:r>
+        <w:rPr>
+          <w:lang w:val="vi-VN"/>
+        </w:rPr>
+        <w:t xml:space="preserve">2020: PHP 8 phát hành với những thay đổi quan trọng, đưa ngôn ngữ lên một tầm cao </w:t>
+      </w:r>
+      <w:r>
+        <w:rPr>
+          <w:lang w:val="vi-VN"/>
+        </w:rPr>
+        <w:t>mới</w:t>
+      </w:r>
+      <w:r>
+        <w:rPr>
+          <w:lang w:val="vi-VN"/>
+        </w:rPr>
+        <w:t>.</w:t>
+      </w:r>
+    </w:p>
+    <w:p>
+      <w:pPr>
+        <w:pStyle w:val="Heading2"/>
+        <w:rPr>
+          <w:lang w:val="vi-VN"/>
+        </w:rPr>
+      </w:pPr>
+      <w:r>
+        <w:t xml:space="preserve">Ngôn ngữ truy vấn </w:t>
+      </w:r>
+      <w:r>
+        <w:t>SQL</w:t>
+      </w:r>
+    </w:p>
+    <w:p>
+      <w:pPr>
+        <w:pStyle w:val="Heading3"/>
+        <w:rPr>
+          <w:lang w:val="vi-VN"/>
+        </w:rPr>
+      </w:pPr>
+      <w:bookmarkStart w:id="2" w:name="_Toc218514158"/>
+      <w:r>
+        <w:rPr>
+          <w:lang w:val="vi-VN"/>
+        </w:rPr>
+        <w:t>Giới thiệu</w:t>
+      </w:r>
       <w:bookmarkEnd w:id="2"/>
-    </w:p>
-    <w:p>
-      <w:pPr>
-        <w:pStyle w:val="Heading3"/>
-        <w:rPr>
-          <w:lang w:val="vi-VN"/>
-        </w:rPr>
-      </w:pPr>
-      <w:bookmarkStart w:id="3" w:name="_Toc218514173"/>
-      <w:r>
-        <w:rPr>
-          <w:lang w:val="vi-VN"/>
-        </w:rPr>
-        <w:t>Mô hình kết nối PHP với MySQL</w:t>
-      </w:r>
-      <w:bookmarkEnd w:id="3"/>
-    </w:p>
-    <w:p>
-      <w:pPr>
-        <w:pStyle w:val="Heading3"/>
-        <w:rPr>
-          <w:szCs w:val="26"/>
-          <w:lang w:val="vi-VN"/>
-        </w:rPr>
-      </w:pPr>
-      <w:bookmarkStart w:id="4" w:name="_Toc218514174"/>
-      <w:r>
-        <w:rPr>
-          <w:szCs w:val="26"/>
-        </w:rPr>
-        <w:t>Vai</w:t>
-      </w:r>
-      <w:r>
-        <w:rPr>
-          <w:szCs w:val="26"/>
-          <w:lang w:val="vi-VN"/>
-        </w:rPr>
-        <w:t xml:space="preserve"> trò</w:t>
-      </w:r>
-      <w:bookmarkEnd w:id="4"/>
-    </w:p>
-    <w:p>
-      <w:pPr>
-        <w:pStyle w:val="Heading2"/>
-        <w:rPr>
-          <w:lang w:val="vi-VN"/>
-        </w:rPr>
-      </w:pPr>
-      <w:r>
-        <w:t xml:space="preserve">Ngôn ngữ truy vấn </w:t>
-      </w:r>
-      <w:r>
-        <w:t>SQL</w:t>
-      </w:r>
-    </w:p>
-    <w:p>
-      <w:pPr>
-        <w:pStyle w:val="Heading3"/>
-        <w:rPr>
-          <w:lang w:val="vi-VN"/>
-        </w:rPr>
-      </w:pPr>
-      <w:bookmarkStart w:id="5" w:name="_Toc218514158"/>
-      <w:r>
-        <w:rPr>
-          <w:lang w:val="vi-VN"/>
-        </w:rPr>
-        <w:t>Giới thiệu</w:t>
-      </w:r>
-      <w:bookmarkEnd w:id="5"/>
     </w:p>
     <w:p>
       <w:pPr>
@@ -3835,11 +4016,11 @@
           <w:lang w:val="vi-VN"/>
         </w:rPr>
       </w:pPr>
-      <w:bookmarkStart w:id="6" w:name="_Ref242367482"/>
+      <w:bookmarkStart w:id="3" w:name="_Ref242367482"/>
       <w:r>
         <w:t>Mô tả bài toán</w:t>
       </w:r>
-      <w:bookmarkEnd w:id="6"/>
+      <w:bookmarkEnd w:id="3"/>
     </w:p>
     <w:p>
       <w:pPr>
@@ -3988,8 +4169,8 @@
           <w:lang w:val="vi-VN"/>
         </w:rPr>
       </w:pPr>
-      <w:bookmarkStart w:id="7" w:name="_Ref242454868"/>
-      <w:bookmarkStart w:id="8" w:name="_Toc242645973"/>
+      <w:bookmarkStart w:id="4" w:name="_Ref242454868"/>
+      <w:bookmarkStart w:id="5" w:name="_Toc242645973"/>
       <w:r>
         <w:rPr>
           <w:i w:val="0"/>
@@ -4112,7 +4293,7 @@
         </w:rPr>
         <w:fldChar w:fldCharType="end"/>
       </w:r>
-      <w:bookmarkEnd w:id="7"/>
+      <w:bookmarkEnd w:id="4"/>
       <w:r>
         <w:t xml:space="preserve"> </w:t>
       </w:r>
@@ -4126,7 +4307,7 @@
         </w:rPr>
         <w:t>Các yêu cầu chức năng của hệ thống</w:t>
       </w:r>
-      <w:bookmarkEnd w:id="8"/>
+      <w:bookmarkEnd w:id="5"/>
     </w:p>
     <w:tbl>
       <w:tblPr>
@@ -6355,8 +6536,8 @@
           <w:lang w:val="vi-VN"/>
         </w:rPr>
       </w:pPr>
-      <w:bookmarkStart w:id="9" w:name="_Ref242455183"/>
-      <w:bookmarkStart w:id="10" w:name="_Toc242645974"/>
+      <w:bookmarkStart w:id="6" w:name="_Ref242455183"/>
+      <w:bookmarkStart w:id="7" w:name="_Toc242645974"/>
       <w:r>
         <w:rPr>
           <w:i w:val="0"/>
@@ -6479,7 +6660,7 @@
         </w:rPr>
         <w:fldChar w:fldCharType="end"/>
       </w:r>
-      <w:bookmarkEnd w:id="9"/>
+      <w:bookmarkEnd w:id="6"/>
       <w:r>
         <w:rPr>
           <w:i w:val="0"/>
@@ -6522,7 +6703,7 @@
         </w:rPr>
         <w:t>chức năng</w:t>
       </w:r>
-      <w:bookmarkEnd w:id="10"/>
+      <w:bookmarkEnd w:id="7"/>
     </w:p>
     <w:tbl>
       <w:tblPr>
@@ -7505,8 +7686,8 @@
           <w:lang w:val="vi-VN"/>
         </w:rPr>
       </w:pPr>
-      <w:bookmarkStart w:id="11" w:name="_Toc242546993"/>
-      <w:bookmarkStart w:id="12" w:name="_Toc242724018"/>
+      <w:bookmarkStart w:id="8" w:name="_Toc242546993"/>
+      <w:bookmarkStart w:id="9" w:name="_Toc242724018"/>
       <w:r>
         <w:rPr>
           <w:i w:val="0"/>
@@ -7650,8 +7831,8 @@
         </w:rPr>
         <w:t xml:space="preserve"> trúc hệ thống</w:t>
       </w:r>
-      <w:bookmarkEnd w:id="11"/>
-      <w:bookmarkEnd w:id="12"/>
+      <w:bookmarkEnd w:id="8"/>
+      <w:bookmarkEnd w:id="9"/>
     </w:p>
     <w:p>
       <w:pPr>
@@ -7765,8 +7946,8 @@
           <w:lang w:val="vi-VN"/>
         </w:rPr>
       </w:pPr>
-      <w:bookmarkStart w:id="13" w:name="_Toc242546994"/>
-      <w:bookmarkStart w:id="14" w:name="_Toc242724019"/>
+      <w:bookmarkStart w:id="10" w:name="_Toc242546994"/>
+      <w:bookmarkStart w:id="11" w:name="_Toc242724019"/>
       <w:r>
         <w:rPr>
           <w:i w:val="0"/>
@@ -7900,8 +8081,8 @@
         </w:rPr>
         <w:t xml:space="preserve"> Mô hình ERD</w:t>
       </w:r>
-      <w:bookmarkEnd w:id="13"/>
-      <w:bookmarkEnd w:id="14"/>
+      <w:bookmarkEnd w:id="10"/>
+      <w:bookmarkEnd w:id="11"/>
     </w:p>
     <w:p>
       <w:pPr>
@@ -8091,9 +8272,9 @@
           <w:lang w:val="vi-VN"/>
         </w:rPr>
       </w:pPr>
-      <w:bookmarkStart w:id="15" w:name="_Ref242454215"/>
-      <w:bookmarkStart w:id="16" w:name="_Ref242645622"/>
-      <w:bookmarkStart w:id="17" w:name="_Toc242645975"/>
+      <w:bookmarkStart w:id="12" w:name="_Ref242454215"/>
+      <w:bookmarkStart w:id="13" w:name="_Ref242645622"/>
+      <w:bookmarkStart w:id="14" w:name="_Toc242645975"/>
       <w:r>
         <w:rPr>
           <w:i w:val="0"/>
@@ -8216,7 +8397,7 @@
         </w:rPr>
         <w:fldChar w:fldCharType="end"/>
       </w:r>
-      <w:bookmarkEnd w:id="15"/>
+      <w:bookmarkEnd w:id="12"/>
       <w:r>
         <w:rPr>
           <w:i w:val="0"/>
@@ -8248,8 +8429,8 @@
         </w:rPr>
         <w:t>hực thể Categories</w:t>
       </w:r>
-      <w:bookmarkEnd w:id="16"/>
-      <w:bookmarkEnd w:id="17"/>
+      <w:bookmarkEnd w:id="13"/>
+      <w:bookmarkEnd w:id="14"/>
     </w:p>
     <w:tbl>
       <w:tblPr>
@@ -8738,11 +8919,11 @@
           <w:lang w:val="vi-VN"/>
         </w:rPr>
       </w:pPr>
-      <w:bookmarkStart w:id="18" w:name="_Ref242645558"/>
-      <w:bookmarkStart w:id="19" w:name="_Ref242645572"/>
-      <w:bookmarkStart w:id="20" w:name="_Ref242645608"/>
-      <w:bookmarkStart w:id="21" w:name="_Ref242645619"/>
-      <w:bookmarkStart w:id="22" w:name="_Toc242645976"/>
+      <w:bookmarkStart w:id="15" w:name="_Ref242645558"/>
+      <w:bookmarkStart w:id="16" w:name="_Ref242645572"/>
+      <w:bookmarkStart w:id="17" w:name="_Ref242645608"/>
+      <w:bookmarkStart w:id="18" w:name="_Ref242645619"/>
+      <w:bookmarkStart w:id="19" w:name="_Toc242645976"/>
       <w:r>
         <w:t xml:space="preserve">Bảng </w:t>
       </w:r>
@@ -8797,11 +8978,11 @@
         </w:rPr>
         <w:t xml:space="preserve"> Thực thể Supplier</w:t>
       </w:r>
+      <w:bookmarkEnd w:id="15"/>
+      <w:bookmarkEnd w:id="16"/>
+      <w:bookmarkEnd w:id="17"/>
       <w:bookmarkEnd w:id="18"/>
       <w:bookmarkEnd w:id="19"/>
-      <w:bookmarkEnd w:id="20"/>
-      <w:bookmarkEnd w:id="21"/>
-      <w:bookmarkEnd w:id="22"/>
     </w:p>
     <w:tbl>
       <w:tblPr>
@@ -9744,9 +9925,9 @@
           <w:lang w:val="vi-VN"/>
         </w:rPr>
       </w:pPr>
-      <w:bookmarkStart w:id="23" w:name="_Ref242454583"/>
-      <w:bookmarkStart w:id="24" w:name="_Ref242645705"/>
-      <w:bookmarkStart w:id="25" w:name="_Toc242645977"/>
+      <w:bookmarkStart w:id="20" w:name="_Ref242454583"/>
+      <w:bookmarkStart w:id="21" w:name="_Ref242645705"/>
+      <w:bookmarkStart w:id="22" w:name="_Toc242645977"/>
       <w:r>
         <w:rPr>
           <w:szCs w:val="26"/>
@@ -9821,7 +10002,7 @@
         </w:rPr>
         <w:fldChar w:fldCharType="end"/>
       </w:r>
-      <w:bookmarkEnd w:id="23"/>
+      <w:bookmarkEnd w:id="20"/>
       <w:r>
         <w:rPr>
           <w:szCs w:val="26"/>
@@ -9832,8 +10013,8 @@
       <w:r>
         <w:t>Thực thể Customers</w:t>
       </w:r>
-      <w:bookmarkEnd w:id="24"/>
-      <w:bookmarkEnd w:id="25"/>
+      <w:bookmarkEnd w:id="21"/>
+      <w:bookmarkEnd w:id="22"/>
     </w:p>
     <w:tbl>
       <w:tblPr>
@@ -10750,9 +10931,9 @@
           <w:lang w:val="vi-VN"/>
         </w:rPr>
       </w:pPr>
-      <w:bookmarkStart w:id="26" w:name="_Ref242456404"/>
-      <w:bookmarkStart w:id="27" w:name="_Ref242645743"/>
-      <w:bookmarkStart w:id="28" w:name="_Toc242645978"/>
+      <w:bookmarkStart w:id="23" w:name="_Ref242456404"/>
+      <w:bookmarkStart w:id="24" w:name="_Ref242645743"/>
+      <w:bookmarkStart w:id="25" w:name="_Toc242645978"/>
       <w:r>
         <w:rPr>
           <w:szCs w:val="26"/>
@@ -10827,7 +11008,7 @@
         </w:rPr>
         <w:fldChar w:fldCharType="end"/>
       </w:r>
-      <w:bookmarkEnd w:id="26"/>
+      <w:bookmarkEnd w:id="23"/>
       <w:r>
         <w:rPr>
           <w:szCs w:val="26"/>
@@ -10838,8 +11019,8 @@
       <w:r>
         <w:t>Thực thể Employees</w:t>
       </w:r>
-      <w:bookmarkEnd w:id="27"/>
-      <w:bookmarkEnd w:id="28"/>
+      <w:bookmarkEnd w:id="24"/>
+      <w:bookmarkEnd w:id="25"/>
     </w:p>
     <w:tbl>
       <w:tblPr>
@@ -11582,9 +11763,9 @@
           <w:lang w:val="vi-VN"/>
         </w:rPr>
       </w:pPr>
-      <w:bookmarkStart w:id="29" w:name="_Ref242456647"/>
-      <w:bookmarkStart w:id="30" w:name="_Ref242645788"/>
-      <w:bookmarkStart w:id="31" w:name="_Toc242645979"/>
+      <w:bookmarkStart w:id="26" w:name="_Ref242456647"/>
+      <w:bookmarkStart w:id="27" w:name="_Ref242645788"/>
+      <w:bookmarkStart w:id="28" w:name="_Toc242645979"/>
       <w:r>
         <w:rPr>
           <w:szCs w:val="26"/>
@@ -11659,7 +11840,7 @@
         </w:rPr>
         <w:fldChar w:fldCharType="end"/>
       </w:r>
-      <w:bookmarkEnd w:id="29"/>
+      <w:bookmarkEnd w:id="26"/>
       <w:r>
         <w:rPr>
           <w:szCs w:val="26"/>
@@ -11670,8 +11851,8 @@
       <w:r>
         <w:t>Thực thể Shippers</w:t>
       </w:r>
-      <w:bookmarkEnd w:id="30"/>
-      <w:bookmarkEnd w:id="31"/>
+      <w:bookmarkEnd w:id="27"/>
+      <w:bookmarkEnd w:id="28"/>
     </w:p>
     <w:tbl>
       <w:tblPr>
@@ -12138,9 +12319,9 @@
           <w:lang w:val="vi-VN"/>
         </w:rPr>
       </w:pPr>
-      <w:bookmarkStart w:id="32" w:name="_Ref242457071"/>
-      <w:bookmarkStart w:id="33" w:name="_Ref242645847"/>
-      <w:bookmarkStart w:id="34" w:name="_Toc242645980"/>
+      <w:bookmarkStart w:id="29" w:name="_Ref242457071"/>
+      <w:bookmarkStart w:id="30" w:name="_Ref242645847"/>
+      <w:bookmarkStart w:id="31" w:name="_Toc242645980"/>
       <w:r>
         <w:rPr>
           <w:szCs w:val="26"/>
@@ -12215,12 +12396,12 @@
         </w:rPr>
         <w:fldChar w:fldCharType="end"/>
       </w:r>
-      <w:bookmarkEnd w:id="32"/>
+      <w:bookmarkEnd w:id="29"/>
       <w:r>
         <w:t xml:space="preserve"> Thực thể Products</w:t>
       </w:r>
-      <w:bookmarkEnd w:id="33"/>
-      <w:bookmarkEnd w:id="34"/>
+      <w:bookmarkEnd w:id="30"/>
+      <w:bookmarkEnd w:id="31"/>
     </w:p>
     <w:tbl>
       <w:tblPr>
@@ -13305,9 +13486,9 @@
           <w:lang w:val="vi-VN"/>
         </w:rPr>
       </w:pPr>
-      <w:bookmarkStart w:id="35" w:name="_Ref242457136"/>
-      <w:bookmarkStart w:id="36" w:name="_Ref242645875"/>
-      <w:bookmarkStart w:id="37" w:name="_Toc242645981"/>
+      <w:bookmarkStart w:id="32" w:name="_Ref242457136"/>
+      <w:bookmarkStart w:id="33" w:name="_Ref242645875"/>
+      <w:bookmarkStart w:id="34" w:name="_Toc242645981"/>
       <w:r>
         <w:rPr>
           <w:szCs w:val="26"/>
@@ -13382,7 +13563,7 @@
         </w:rPr>
         <w:fldChar w:fldCharType="end"/>
       </w:r>
-      <w:bookmarkEnd w:id="35"/>
+      <w:bookmarkEnd w:id="32"/>
       <w:r>
         <w:rPr>
           <w:szCs w:val="26"/>
@@ -13393,8 +13574,8 @@
       <w:r>
         <w:t>Thực thể Product_Images</w:t>
       </w:r>
-      <w:bookmarkEnd w:id="36"/>
-      <w:bookmarkEnd w:id="37"/>
+      <w:bookmarkEnd w:id="33"/>
+      <w:bookmarkEnd w:id="34"/>
     </w:p>
     <w:tbl>
       <w:tblPr>
@@ -14145,9 +14326,9 @@
           <w:lang w:val="vi-VN"/>
         </w:rPr>
       </w:pPr>
-      <w:bookmarkStart w:id="38" w:name="_Ref242457632"/>
-      <w:bookmarkStart w:id="39" w:name="_Ref242645910"/>
-      <w:bookmarkStart w:id="40" w:name="_Toc242645982"/>
+      <w:bookmarkStart w:id="35" w:name="_Ref242457632"/>
+      <w:bookmarkStart w:id="36" w:name="_Ref242645910"/>
+      <w:bookmarkStart w:id="37" w:name="_Toc242645982"/>
       <w:r>
         <w:rPr>
           <w:szCs w:val="26"/>
@@ -14223,7 +14404,7 @@
         </w:rPr>
         <w:fldChar w:fldCharType="end"/>
       </w:r>
-      <w:bookmarkEnd w:id="38"/>
+      <w:bookmarkEnd w:id="35"/>
       <w:r>
         <w:rPr>
           <w:szCs w:val="26"/>
@@ -14234,8 +14415,8 @@
       <w:r>
         <w:t>Thực thể Orders</w:t>
       </w:r>
-      <w:bookmarkEnd w:id="39"/>
-      <w:bookmarkEnd w:id="40"/>
+      <w:bookmarkEnd w:id="36"/>
+      <w:bookmarkEnd w:id="37"/>
     </w:p>
     <w:tbl>
       <w:tblPr>
@@ -14950,9 +15131,9 @@
           <w:lang w:val="vi-VN"/>
         </w:rPr>
       </w:pPr>
-      <w:bookmarkStart w:id="41" w:name="_Ref242458121"/>
-      <w:bookmarkStart w:id="42" w:name="_Ref242645951"/>
-      <w:bookmarkStart w:id="43" w:name="_Toc242645983"/>
+      <w:bookmarkStart w:id="38" w:name="_Ref242458121"/>
+      <w:bookmarkStart w:id="39" w:name="_Ref242645951"/>
+      <w:bookmarkStart w:id="40" w:name="_Toc242645983"/>
       <w:r>
         <w:rPr>
           <w:i w:val="0"/>
@@ -15075,7 +15256,7 @@
         </w:rPr>
         <w:fldChar w:fldCharType="end"/>
       </w:r>
-      <w:bookmarkEnd w:id="41"/>
+      <w:bookmarkEnd w:id="38"/>
       <w:r>
         <w:rPr>
           <w:i w:val="0"/>
@@ -15128,8 +15309,8 @@
         </w:rPr>
         <w:t>OrderDetail</w:t>
       </w:r>
-      <w:bookmarkEnd w:id="42"/>
-      <w:bookmarkEnd w:id="43"/>
+      <w:bookmarkEnd w:id="39"/>
+      <w:bookmarkEnd w:id="40"/>
     </w:p>
     <w:tbl>
       <w:tblPr>
@@ -15744,8 +15925,8 @@
           <w:lang w:val="vi-VN"/>
         </w:rPr>
       </w:pPr>
-      <w:bookmarkStart w:id="44" w:name="_Toc242546995"/>
-      <w:bookmarkStart w:id="45" w:name="_Toc242724020"/>
+      <w:bookmarkStart w:id="41" w:name="_Toc242546995"/>
+      <w:bookmarkStart w:id="42" w:name="_Toc242724020"/>
       <w:r>
         <w:rPr>
           <w:i w:val="0"/>
@@ -15879,8 +16060,8 @@
         </w:rPr>
         <w:t xml:space="preserve"> Sơ đồ website</w:t>
       </w:r>
-      <w:bookmarkEnd w:id="44"/>
-      <w:bookmarkEnd w:id="45"/>
+      <w:bookmarkEnd w:id="41"/>
+      <w:bookmarkEnd w:id="42"/>
     </w:p>
     <w:p>
       <w:pPr>
@@ -15999,8 +16180,8 @@
           <w:lang w:val="vi-VN"/>
         </w:rPr>
       </w:pPr>
-      <w:bookmarkStart w:id="46" w:name="_Toc242546996"/>
-      <w:bookmarkStart w:id="47" w:name="_Toc242724021"/>
+      <w:bookmarkStart w:id="43" w:name="_Toc242546996"/>
+      <w:bookmarkStart w:id="44" w:name="_Toc242724021"/>
       <w:r>
         <w:rPr>
           <w:i w:val="0"/>
@@ -16134,8 +16315,8 @@
         </w:rPr>
         <w:t xml:space="preserve"> Giao diện trang chủ</w:t>
       </w:r>
-      <w:bookmarkEnd w:id="46"/>
-      <w:bookmarkEnd w:id="47"/>
+      <w:bookmarkEnd w:id="43"/>
+      <w:bookmarkEnd w:id="44"/>
     </w:p>
     <w:p>
       <w:pPr>
@@ -16273,8 +16454,8 @@
           <w:lang w:val="vi-VN"/>
         </w:rPr>
       </w:pPr>
-      <w:bookmarkStart w:id="48" w:name="_Toc242546997"/>
-      <w:bookmarkStart w:id="49" w:name="_Toc242724022"/>
+      <w:bookmarkStart w:id="45" w:name="_Toc242546997"/>
+      <w:bookmarkStart w:id="46" w:name="_Toc242724022"/>
       <w:r>
         <w:rPr>
           <w:i w:val="0"/>
@@ -16408,8 +16589,8 @@
         </w:rPr>
         <w:t xml:space="preserve"> Giao diện trang quản trị</w:t>
       </w:r>
-      <w:bookmarkEnd w:id="48"/>
-      <w:bookmarkEnd w:id="49"/>
+      <w:bookmarkEnd w:id="45"/>
+      <w:bookmarkEnd w:id="46"/>
     </w:p>
     <w:p>
       <w:pPr>
@@ -16532,8 +16713,8 @@
           <w:lang w:val="vi-VN"/>
         </w:rPr>
       </w:pPr>
-      <w:bookmarkStart w:id="50" w:name="_Toc242546998"/>
-      <w:bookmarkStart w:id="51" w:name="_Toc242724023"/>
+      <w:bookmarkStart w:id="47" w:name="_Toc242546998"/>
+      <w:bookmarkStart w:id="48" w:name="_Toc242724023"/>
       <w:r>
         <w:rPr>
           <w:i w:val="0"/>
@@ -16667,8 +16848,8 @@
         </w:rPr>
         <w:t xml:space="preserve"> Giao diện trang đăng nhập và đăng ký</w:t>
       </w:r>
-      <w:bookmarkEnd w:id="50"/>
-      <w:bookmarkEnd w:id="51"/>
+      <w:bookmarkEnd w:id="47"/>
+      <w:bookmarkEnd w:id="48"/>
     </w:p>
     <w:p>
       <w:pPr>
@@ -16793,8 +16974,8 @@
           <w:lang w:val="vi-VN"/>
         </w:rPr>
       </w:pPr>
-      <w:bookmarkStart w:id="52" w:name="_Toc242546999"/>
-      <w:bookmarkStart w:id="53" w:name="_Toc242724024"/>
+      <w:bookmarkStart w:id="49" w:name="_Toc242546999"/>
+      <w:bookmarkStart w:id="50" w:name="_Toc242724024"/>
       <w:r>
         <w:rPr>
           <w:i w:val="0"/>
@@ -16928,8 +17109,8 @@
         </w:rPr>
         <w:t xml:space="preserve"> Giao diện trang sản phẩm</w:t>
       </w:r>
-      <w:bookmarkEnd w:id="52"/>
-      <w:bookmarkEnd w:id="53"/>
+      <w:bookmarkEnd w:id="49"/>
+      <w:bookmarkEnd w:id="50"/>
     </w:p>
     <w:p>
       <w:pPr>
@@ -17034,8 +17215,8 @@
           <w:lang w:val="vi-VN"/>
         </w:rPr>
       </w:pPr>
-      <w:bookmarkStart w:id="54" w:name="_Toc242547000"/>
-      <w:bookmarkStart w:id="55" w:name="_Toc242724025"/>
+      <w:bookmarkStart w:id="51" w:name="_Toc242547000"/>
+      <w:bookmarkStart w:id="52" w:name="_Toc242724025"/>
       <w:r>
         <w:rPr>
           <w:i w:val="0"/>
@@ -17169,8 +17350,8 @@
         </w:rPr>
         <w:t xml:space="preserve"> Giao diện trang chi tiết sản phẩm</w:t>
       </w:r>
-      <w:bookmarkEnd w:id="54"/>
-      <w:bookmarkEnd w:id="55"/>
+      <w:bookmarkEnd w:id="51"/>
+      <w:bookmarkEnd w:id="52"/>
     </w:p>
     <w:p>
       <w:pPr>
@@ -17403,7 +17584,7 @@
           <w:lang w:val="vi-VN"/>
         </w:rPr>
       </w:pPr>
-      <w:bookmarkStart w:id="56" w:name="_Toc242724026"/>
+      <w:bookmarkStart w:id="53" w:name="_Toc242724026"/>
       <w:r>
         <w:rPr>
           <w:i w:val="0"/>
@@ -17537,7 +17718,7 @@
         </w:rPr>
         <w:t xml:space="preserve"> Mô hình DFD mức ngữ cảnh</w:t>
       </w:r>
-      <w:bookmarkEnd w:id="56"/>
+      <w:bookmarkEnd w:id="53"/>
     </w:p>
     <w:p>
       <w:pPr>
@@ -17673,7 +17854,7 @@
           <w:szCs w:val="26"/>
         </w:rPr>
       </w:pPr>
-      <w:bookmarkStart w:id="57" w:name="_Toc242724027"/>
+      <w:bookmarkStart w:id="54" w:name="_Toc242724027"/>
       <w:r>
         <w:rPr>
           <w:i w:val="0"/>
@@ -17839,7 +18020,7 @@
         </w:rPr>
         <w:t>1</w:t>
       </w:r>
-      <w:bookmarkEnd w:id="57"/>
+      <w:bookmarkEnd w:id="54"/>
     </w:p>
     <w:p>
       <w:pPr>
@@ -17993,7 +18174,7 @@
           <w:szCs w:val="26"/>
         </w:rPr>
       </w:pPr>
-      <w:bookmarkStart w:id="58" w:name="_Toc242724028"/>
+      <w:bookmarkStart w:id="55" w:name="_Toc242724028"/>
       <w:r>
         <w:rPr>
           <w:i w:val="0"/>
@@ -18170,7 +18351,7 @@
         </w:rPr>
         <w:t>1.1</w:t>
       </w:r>
-      <w:bookmarkEnd w:id="58"/>
+      <w:bookmarkEnd w:id="55"/>
     </w:p>
     <w:p>
       <w:pPr>
@@ -18326,7 +18507,7 @@
           <w:lang w:val="vi-VN"/>
         </w:rPr>
       </w:pPr>
-      <w:bookmarkStart w:id="59" w:name="_Toc242724029"/>
+      <w:bookmarkStart w:id="56" w:name="_Toc242724029"/>
       <w:r>
         <w:rPr>
           <w:i w:val="0"/>
@@ -18515,7 +18696,7 @@
         </w:rPr>
         <w:t xml:space="preserve"> 1.2</w:t>
       </w:r>
-      <w:bookmarkEnd w:id="59"/>
+      <w:bookmarkEnd w:id="56"/>
       <w:r>
         <w:rPr>
           <w:i w:val="0"/>
@@ -18664,7 +18845,7 @@
           <w:lang w:val="vi-VN"/>
         </w:rPr>
       </w:pPr>
-      <w:bookmarkStart w:id="60" w:name="_Toc242724030"/>
+      <w:bookmarkStart w:id="57" w:name="_Toc242724030"/>
       <w:r>
         <w:rPr>
           <w:i w:val="0"/>
@@ -18830,7 +19011,7 @@
         </w:rPr>
         <w:t>1.3</w:t>
       </w:r>
-      <w:bookmarkEnd w:id="60"/>
+      <w:bookmarkEnd w:id="57"/>
     </w:p>
     <w:p>
       <w:pPr>
@@ -18951,7 +19132,7 @@
           <w:lang w:val="vi-VN"/>
         </w:rPr>
       </w:pPr>
-      <w:bookmarkStart w:id="61" w:name="_Toc242724031"/>
+      <w:bookmarkStart w:id="58" w:name="_Toc242724031"/>
       <w:r>
         <w:rPr>
           <w:i w:val="0"/>
@@ -19127,7 +19308,7 @@
         </w:rPr>
         <w:t>DFD mức 1.4</w:t>
       </w:r>
-      <w:bookmarkEnd w:id="61"/>
+      <w:bookmarkEnd w:id="58"/>
     </w:p>
     <w:p>
       <w:pPr>
@@ -19260,7 +19441,7 @@
           <w:lang w:val="vi-VN"/>
         </w:rPr>
       </w:pPr>
-      <w:bookmarkStart w:id="62" w:name="_Toc242724032"/>
+      <w:bookmarkStart w:id="59" w:name="_Toc242724032"/>
       <w:r>
         <w:rPr>
           <w:i w:val="0"/>
@@ -19426,7 +19607,7 @@
         </w:rPr>
         <w:t>1.5</w:t>
       </w:r>
-      <w:bookmarkEnd w:id="62"/>
+      <w:bookmarkEnd w:id="59"/>
     </w:p>
     <w:p>
       <w:pPr>

</xml_diff>